<commit_message>
With and without array_utils
</commit_message>
<xml_diff>
--- a/Lab Assignment 5/Lab Assignment 5.docx
+++ b/Lab Assignment 5/Lab Assignment 5.docx
@@ -12768,6 +12768,2076 @@
         </w:rPr>
         <w:lastRenderedPageBreak/>
         <w:t xml:space="preserve">Question 9: </w:t>
+      </w:r>
+      <w:r>
+        <w:rPr>
+          <w:rFonts w:ascii="Lucida Sans" w:hAnsi="Lucida Sans"/>
+          <w:lang w:val="en-US"/>
+        </w:rPr>
+        <w:t>Take the union and intersection of two arrays.</w:t>
+      </w:r>
+    </w:p>
+    <w:p>
+      <w:pPr>
+        <w:spacing w:after="0"/>
+        <w:rPr>
+          <w:rFonts w:ascii="Lucida Sans" w:hAnsi="Lucida Sans"/>
+          <w:lang w:val="en-US"/>
+        </w:rPr>
+      </w:pPr>
+      <w:r>
+        <w:rPr>
+          <w:rFonts w:ascii="Lucida Sans" w:hAnsi="Lucida Sans"/>
+          <w:lang w:val="en-US"/>
+        </w:rPr>
+        <w:t>#include&lt;stdio.h&gt;</w:t>
+      </w:r>
+    </w:p>
+    <w:p>
+      <w:pPr>
+        <w:spacing w:after="0"/>
+        <w:rPr>
+          <w:rFonts w:ascii="Lucida Sans" w:hAnsi="Lucida Sans"/>
+          <w:lang w:val="en-US"/>
+        </w:rPr>
+      </w:pPr>
+      <w:r>
+        <w:rPr>
+          <w:rFonts w:ascii="Lucida Sans" w:hAnsi="Lucida Sans"/>
+          <w:lang w:val="en-US"/>
+        </w:rPr>
+        <w:t>#include "</w:t>
+      </w:r>
+      <w:proofErr w:type="spellStart"/>
+      <w:r>
+        <w:rPr>
+          <w:rFonts w:ascii="Lucida Sans" w:hAnsi="Lucida Sans"/>
+          <w:lang w:val="en-US"/>
+        </w:rPr>
+        <w:t>array_utils.h</w:t>
+      </w:r>
+      <w:proofErr w:type="spellEnd"/>
+      <w:r>
+        <w:rPr>
+          <w:rFonts w:ascii="Lucida Sans" w:hAnsi="Lucida Sans"/>
+          <w:lang w:val="en-US"/>
+        </w:rPr>
+        <w:t>"</w:t>
+      </w:r>
+    </w:p>
+    <w:p>
+      <w:pPr>
+        <w:spacing w:after="0"/>
+        <w:rPr>
+          <w:rFonts w:ascii="Lucida Sans" w:hAnsi="Lucida Sans"/>
+          <w:lang w:val="en-US"/>
+        </w:rPr>
+      </w:pPr>
+      <w:r>
+        <w:rPr>
+          <w:rFonts w:ascii="Lucida Sans" w:hAnsi="Lucida Sans"/>
+          <w:lang w:val="en-US"/>
+        </w:rPr>
+        <w:t xml:space="preserve">int </w:t>
+      </w:r>
+      <w:proofErr w:type="gramStart"/>
+      <w:r>
+        <w:rPr>
+          <w:rFonts w:ascii="Lucida Sans" w:hAnsi="Lucida Sans"/>
+          <w:lang w:val="en-US"/>
+        </w:rPr>
+        <w:t>main(){</w:t>
+      </w:r>
+      <w:proofErr w:type="gramEnd"/>
+    </w:p>
+    <w:p>
+      <w:pPr>
+        <w:spacing w:after="0"/>
+        <w:rPr>
+          <w:rFonts w:ascii="Lucida Sans" w:hAnsi="Lucida Sans"/>
+          <w:lang w:val="en-US"/>
+        </w:rPr>
+      </w:pPr>
+      <w:r>
+        <w:rPr>
+          <w:rFonts w:ascii="Lucida Sans" w:hAnsi="Lucida Sans"/>
+          <w:lang w:val="en-US"/>
+        </w:rPr>
+        <w:t xml:space="preserve">    int </w:t>
+      </w:r>
+      <w:proofErr w:type="spellStart"/>
+      <w:r>
+        <w:rPr>
+          <w:rFonts w:ascii="Lucida Sans" w:hAnsi="Lucida Sans"/>
+          <w:lang w:val="en-US"/>
+        </w:rPr>
+        <w:t>i</w:t>
+      </w:r>
+      <w:proofErr w:type="spellEnd"/>
+      <w:r>
+        <w:rPr>
+          <w:rFonts w:ascii="Lucida Sans" w:hAnsi="Lucida Sans"/>
+          <w:lang w:val="en-US"/>
+        </w:rPr>
+        <w:t>, j, n1, n2;</w:t>
+      </w:r>
+    </w:p>
+    <w:p>
+      <w:pPr>
+        <w:spacing w:after="0"/>
+        <w:rPr>
+          <w:rFonts w:ascii="Lucida Sans" w:hAnsi="Lucida Sans"/>
+          <w:lang w:val="en-US"/>
+        </w:rPr>
+      </w:pPr>
+      <w:r>
+        <w:rPr>
+          <w:rFonts w:ascii="Lucida Sans" w:hAnsi="Lucida Sans"/>
+          <w:lang w:val="en-US"/>
+        </w:rPr>
+        <w:t xml:space="preserve">    int check;</w:t>
+      </w:r>
+    </w:p>
+    <w:p>
+      <w:pPr>
+        <w:spacing w:after="0"/>
+        <w:rPr>
+          <w:rFonts w:ascii="Lucida Sans" w:hAnsi="Lucida Sans"/>
+          <w:lang w:val="en-US"/>
+        </w:rPr>
+      </w:pPr>
+    </w:p>
+    <w:p>
+      <w:pPr>
+        <w:spacing w:after="0"/>
+        <w:rPr>
+          <w:rFonts w:ascii="Lucida Sans" w:hAnsi="Lucida Sans"/>
+          <w:lang w:val="en-US"/>
+        </w:rPr>
+      </w:pPr>
+      <w:r>
+        <w:rPr>
+          <w:rFonts w:ascii="Lucida Sans" w:hAnsi="Lucida Sans"/>
+          <w:lang w:val="en-US"/>
+        </w:rPr>
+        <w:t xml:space="preserve">    </w:t>
+      </w:r>
+      <w:proofErr w:type="spellStart"/>
+      <w:proofErr w:type="gramStart"/>
+      <w:r>
+        <w:rPr>
+          <w:rFonts w:ascii="Lucida Sans" w:hAnsi="Lucida Sans"/>
+          <w:lang w:val="en-US"/>
+        </w:rPr>
+        <w:t>printf</w:t>
+      </w:r>
+      <w:proofErr w:type="spellEnd"/>
+      <w:r>
+        <w:rPr>
+          <w:rFonts w:ascii="Lucida Sans" w:hAnsi="Lucida Sans"/>
+          <w:lang w:val="en-US"/>
+        </w:rPr>
+        <w:t>(</w:t>
+      </w:r>
+      <w:proofErr w:type="gramEnd"/>
+      <w:r>
+        <w:rPr>
+          <w:rFonts w:ascii="Lucida Sans" w:hAnsi="Lucida Sans"/>
+          <w:lang w:val="en-US"/>
+        </w:rPr>
+        <w:t xml:space="preserve">"\n1st Array </w:t>
+      </w:r>
+      <w:proofErr w:type="spellStart"/>
+      <w:r>
+        <w:rPr>
+          <w:rFonts w:ascii="Lucida Sans" w:hAnsi="Lucida Sans"/>
+          <w:lang w:val="en-US"/>
+        </w:rPr>
+        <w:t>lenght</w:t>
+      </w:r>
+      <w:proofErr w:type="spellEnd"/>
+      <w:r>
+        <w:rPr>
+          <w:rFonts w:ascii="Lucida Sans" w:hAnsi="Lucida Sans"/>
+          <w:lang w:val="en-US"/>
+        </w:rPr>
+        <w:t>: ");</w:t>
+      </w:r>
+    </w:p>
+    <w:p>
+      <w:pPr>
+        <w:spacing w:after="0"/>
+        <w:rPr>
+          <w:rFonts w:ascii="Lucida Sans" w:hAnsi="Lucida Sans"/>
+          <w:lang w:val="en-US"/>
+        </w:rPr>
+      </w:pPr>
+      <w:r>
+        <w:rPr>
+          <w:rFonts w:ascii="Lucida Sans" w:hAnsi="Lucida Sans"/>
+          <w:lang w:val="en-US"/>
+        </w:rPr>
+        <w:t xml:space="preserve">    </w:t>
+      </w:r>
+      <w:proofErr w:type="spellStart"/>
+      <w:proofErr w:type="gramStart"/>
+      <w:r>
+        <w:rPr>
+          <w:rFonts w:ascii="Lucida Sans" w:hAnsi="Lucida Sans"/>
+          <w:lang w:val="en-US"/>
+        </w:rPr>
+        <w:t>scanf</w:t>
+      </w:r>
+      <w:proofErr w:type="spellEnd"/>
+      <w:r>
+        <w:rPr>
+          <w:rFonts w:ascii="Lucida Sans" w:hAnsi="Lucida Sans"/>
+          <w:lang w:val="en-US"/>
+        </w:rPr>
+        <w:t>(</w:t>
+      </w:r>
+      <w:proofErr w:type="gramEnd"/>
+      <w:r>
+        <w:rPr>
+          <w:rFonts w:ascii="Lucida Sans" w:hAnsi="Lucida Sans"/>
+          <w:lang w:val="en-US"/>
+        </w:rPr>
+        <w:t>"%d", &amp;n1);</w:t>
+      </w:r>
+    </w:p>
+    <w:p>
+      <w:pPr>
+        <w:spacing w:after="0"/>
+        <w:rPr>
+          <w:rFonts w:ascii="Lucida Sans" w:hAnsi="Lucida Sans"/>
+          <w:lang w:val="en-US"/>
+        </w:rPr>
+      </w:pPr>
+      <w:r>
+        <w:rPr>
+          <w:rFonts w:ascii="Lucida Sans" w:hAnsi="Lucida Sans"/>
+          <w:lang w:val="en-US"/>
+        </w:rPr>
+        <w:t xml:space="preserve">    int arr_1[n1];</w:t>
+      </w:r>
+    </w:p>
+    <w:p>
+      <w:pPr>
+        <w:spacing w:after="0"/>
+        <w:rPr>
+          <w:rFonts w:ascii="Lucida Sans" w:hAnsi="Lucida Sans"/>
+          <w:lang w:val="en-US"/>
+        </w:rPr>
+      </w:pPr>
+    </w:p>
+    <w:p>
+      <w:pPr>
+        <w:spacing w:after="0"/>
+        <w:rPr>
+          <w:rFonts w:ascii="Lucida Sans" w:hAnsi="Lucida Sans"/>
+          <w:lang w:val="en-US"/>
+        </w:rPr>
+      </w:pPr>
+      <w:r>
+        <w:rPr>
+          <w:rFonts w:ascii="Lucida Sans" w:hAnsi="Lucida Sans"/>
+          <w:lang w:val="en-US"/>
+        </w:rPr>
+        <w:t xml:space="preserve">    </w:t>
+      </w:r>
+      <w:proofErr w:type="spellStart"/>
+      <w:proofErr w:type="gramStart"/>
+      <w:r>
+        <w:rPr>
+          <w:rFonts w:ascii="Lucida Sans" w:hAnsi="Lucida Sans"/>
+          <w:lang w:val="en-US"/>
+        </w:rPr>
+        <w:t>printf</w:t>
+      </w:r>
+      <w:proofErr w:type="spellEnd"/>
+      <w:r>
+        <w:rPr>
+          <w:rFonts w:ascii="Lucida Sans" w:hAnsi="Lucida Sans"/>
+          <w:lang w:val="en-US"/>
+        </w:rPr>
+        <w:t>(</w:t>
+      </w:r>
+      <w:proofErr w:type="gramEnd"/>
+      <w:r>
+        <w:rPr>
+          <w:rFonts w:ascii="Lucida Sans" w:hAnsi="Lucida Sans"/>
+          <w:lang w:val="en-US"/>
+        </w:rPr>
+        <w:t>"\</w:t>
+      </w:r>
+      <w:proofErr w:type="spellStart"/>
+      <w:r>
+        <w:rPr>
+          <w:rFonts w:ascii="Lucida Sans" w:hAnsi="Lucida Sans"/>
+          <w:lang w:val="en-US"/>
+        </w:rPr>
+        <w:t>nEnter</w:t>
+      </w:r>
+      <w:proofErr w:type="spellEnd"/>
+      <w:r>
+        <w:rPr>
+          <w:rFonts w:ascii="Lucida Sans" w:hAnsi="Lucida Sans"/>
+          <w:lang w:val="en-US"/>
+        </w:rPr>
+        <w:t xml:space="preserve"> elements: ");</w:t>
+      </w:r>
+    </w:p>
+    <w:p>
+      <w:pPr>
+        <w:spacing w:after="0"/>
+        <w:rPr>
+          <w:rFonts w:ascii="Lucida Sans" w:hAnsi="Lucida Sans"/>
+          <w:lang w:val="en-US"/>
+        </w:rPr>
+      </w:pPr>
+      <w:r>
+        <w:rPr>
+          <w:rFonts w:ascii="Lucida Sans" w:hAnsi="Lucida Sans"/>
+          <w:lang w:val="en-US"/>
+        </w:rPr>
+        <w:t xml:space="preserve">    </w:t>
+      </w:r>
+      <w:proofErr w:type="spellStart"/>
+      <w:proofErr w:type="gramStart"/>
+      <w:r>
+        <w:rPr>
+          <w:rFonts w:ascii="Lucida Sans" w:hAnsi="Lucida Sans"/>
+          <w:lang w:val="en-US"/>
+        </w:rPr>
+        <w:t>inputArray</w:t>
+      </w:r>
+      <w:proofErr w:type="spellEnd"/>
+      <w:r>
+        <w:rPr>
+          <w:rFonts w:ascii="Lucida Sans" w:hAnsi="Lucida Sans"/>
+          <w:lang w:val="en-US"/>
+        </w:rPr>
+        <w:t>(</w:t>
+      </w:r>
+      <w:proofErr w:type="gramEnd"/>
+      <w:r>
+        <w:rPr>
+          <w:rFonts w:ascii="Lucida Sans" w:hAnsi="Lucida Sans"/>
+          <w:lang w:val="en-US"/>
+        </w:rPr>
+        <w:t>arr_1, n1);</w:t>
+      </w:r>
+    </w:p>
+    <w:p>
+      <w:pPr>
+        <w:spacing w:after="0"/>
+        <w:rPr>
+          <w:rFonts w:ascii="Lucida Sans" w:hAnsi="Lucida Sans"/>
+          <w:lang w:val="en-US"/>
+        </w:rPr>
+      </w:pPr>
+    </w:p>
+    <w:p>
+      <w:pPr>
+        <w:spacing w:after="0"/>
+        <w:rPr>
+          <w:rFonts w:ascii="Lucida Sans" w:hAnsi="Lucida Sans"/>
+          <w:lang w:val="en-US"/>
+        </w:rPr>
+      </w:pPr>
+      <w:r>
+        <w:rPr>
+          <w:rFonts w:ascii="Lucida Sans" w:hAnsi="Lucida Sans"/>
+          <w:lang w:val="en-US"/>
+        </w:rPr>
+        <w:t xml:space="preserve">    </w:t>
+      </w:r>
+      <w:proofErr w:type="spellStart"/>
+      <w:proofErr w:type="gramStart"/>
+      <w:r>
+        <w:rPr>
+          <w:rFonts w:ascii="Lucida Sans" w:hAnsi="Lucida Sans"/>
+          <w:lang w:val="en-US"/>
+        </w:rPr>
+        <w:t>printf</w:t>
+      </w:r>
+      <w:proofErr w:type="spellEnd"/>
+      <w:r>
+        <w:rPr>
+          <w:rFonts w:ascii="Lucida Sans" w:hAnsi="Lucida Sans"/>
+          <w:lang w:val="en-US"/>
+        </w:rPr>
+        <w:t>(</w:t>
+      </w:r>
+      <w:proofErr w:type="gramEnd"/>
+      <w:r>
+        <w:rPr>
+          <w:rFonts w:ascii="Lucida Sans" w:hAnsi="Lucida Sans"/>
+          <w:lang w:val="en-US"/>
+        </w:rPr>
+        <w:t xml:space="preserve">"\n2nd Array </w:t>
+      </w:r>
+      <w:proofErr w:type="spellStart"/>
+      <w:r>
+        <w:rPr>
+          <w:rFonts w:ascii="Lucida Sans" w:hAnsi="Lucida Sans"/>
+          <w:lang w:val="en-US"/>
+        </w:rPr>
+        <w:t>lenght</w:t>
+      </w:r>
+      <w:proofErr w:type="spellEnd"/>
+      <w:r>
+        <w:rPr>
+          <w:rFonts w:ascii="Lucida Sans" w:hAnsi="Lucida Sans"/>
+          <w:lang w:val="en-US"/>
+        </w:rPr>
+        <w:t>: ");</w:t>
+      </w:r>
+    </w:p>
+    <w:p>
+      <w:pPr>
+        <w:spacing w:after="0"/>
+        <w:rPr>
+          <w:rFonts w:ascii="Lucida Sans" w:hAnsi="Lucida Sans"/>
+          <w:lang w:val="en-US"/>
+        </w:rPr>
+      </w:pPr>
+      <w:r>
+        <w:rPr>
+          <w:rFonts w:ascii="Lucida Sans" w:hAnsi="Lucida Sans"/>
+          <w:lang w:val="en-US"/>
+        </w:rPr>
+        <w:t xml:space="preserve">    </w:t>
+      </w:r>
+      <w:proofErr w:type="spellStart"/>
+      <w:proofErr w:type="gramStart"/>
+      <w:r>
+        <w:rPr>
+          <w:rFonts w:ascii="Lucida Sans" w:hAnsi="Lucida Sans"/>
+          <w:lang w:val="en-US"/>
+        </w:rPr>
+        <w:t>scanf</w:t>
+      </w:r>
+      <w:proofErr w:type="spellEnd"/>
+      <w:r>
+        <w:rPr>
+          <w:rFonts w:ascii="Lucida Sans" w:hAnsi="Lucida Sans"/>
+          <w:lang w:val="en-US"/>
+        </w:rPr>
+        <w:t>(</w:t>
+      </w:r>
+      <w:proofErr w:type="gramEnd"/>
+      <w:r>
+        <w:rPr>
+          <w:rFonts w:ascii="Lucida Sans" w:hAnsi="Lucida Sans"/>
+          <w:lang w:val="en-US"/>
+        </w:rPr>
+        <w:t>"%d", &amp;n2);</w:t>
+      </w:r>
+    </w:p>
+    <w:p>
+      <w:pPr>
+        <w:spacing w:after="0"/>
+        <w:rPr>
+          <w:rFonts w:ascii="Lucida Sans" w:hAnsi="Lucida Sans"/>
+          <w:lang w:val="en-US"/>
+        </w:rPr>
+      </w:pPr>
+      <w:r>
+        <w:rPr>
+          <w:rFonts w:ascii="Lucida Sans" w:hAnsi="Lucida Sans"/>
+          <w:lang w:val="en-US"/>
+        </w:rPr>
+        <w:t xml:space="preserve">    int arr_2[n2];</w:t>
+      </w:r>
+    </w:p>
+    <w:p>
+      <w:pPr>
+        <w:spacing w:after="0"/>
+        <w:rPr>
+          <w:rFonts w:ascii="Lucida Sans" w:hAnsi="Lucida Sans"/>
+          <w:lang w:val="en-US"/>
+        </w:rPr>
+      </w:pPr>
+    </w:p>
+    <w:p>
+      <w:pPr>
+        <w:spacing w:after="0"/>
+        <w:rPr>
+          <w:rFonts w:ascii="Lucida Sans" w:hAnsi="Lucida Sans"/>
+          <w:lang w:val="en-US"/>
+        </w:rPr>
+      </w:pPr>
+      <w:r>
+        <w:rPr>
+          <w:rFonts w:ascii="Lucida Sans" w:hAnsi="Lucida Sans"/>
+          <w:lang w:val="en-US"/>
+        </w:rPr>
+        <w:t xml:space="preserve">    </w:t>
+      </w:r>
+      <w:proofErr w:type="spellStart"/>
+      <w:proofErr w:type="gramStart"/>
+      <w:r>
+        <w:rPr>
+          <w:rFonts w:ascii="Lucida Sans" w:hAnsi="Lucida Sans"/>
+          <w:lang w:val="en-US"/>
+        </w:rPr>
+        <w:t>printf</w:t>
+      </w:r>
+      <w:proofErr w:type="spellEnd"/>
+      <w:r>
+        <w:rPr>
+          <w:rFonts w:ascii="Lucida Sans" w:hAnsi="Lucida Sans"/>
+          <w:lang w:val="en-US"/>
+        </w:rPr>
+        <w:t>(</w:t>
+      </w:r>
+      <w:proofErr w:type="gramEnd"/>
+      <w:r>
+        <w:rPr>
+          <w:rFonts w:ascii="Lucida Sans" w:hAnsi="Lucida Sans"/>
+          <w:lang w:val="en-US"/>
+        </w:rPr>
+        <w:t>"\</w:t>
+      </w:r>
+      <w:proofErr w:type="spellStart"/>
+      <w:r>
+        <w:rPr>
+          <w:rFonts w:ascii="Lucida Sans" w:hAnsi="Lucida Sans"/>
+          <w:lang w:val="en-US"/>
+        </w:rPr>
+        <w:t>nEnter</w:t>
+      </w:r>
+      <w:proofErr w:type="spellEnd"/>
+      <w:r>
+        <w:rPr>
+          <w:rFonts w:ascii="Lucida Sans" w:hAnsi="Lucida Sans"/>
+          <w:lang w:val="en-US"/>
+        </w:rPr>
+        <w:t xml:space="preserve"> elements: ");</w:t>
+      </w:r>
+    </w:p>
+    <w:p>
+      <w:pPr>
+        <w:spacing w:after="0"/>
+        <w:rPr>
+          <w:rFonts w:ascii="Lucida Sans" w:hAnsi="Lucida Sans"/>
+          <w:lang w:val="en-US"/>
+        </w:rPr>
+      </w:pPr>
+      <w:r>
+        <w:rPr>
+          <w:rFonts w:ascii="Lucida Sans" w:hAnsi="Lucida Sans"/>
+          <w:lang w:val="en-US"/>
+        </w:rPr>
+        <w:t xml:space="preserve">    </w:t>
+      </w:r>
+      <w:proofErr w:type="spellStart"/>
+      <w:proofErr w:type="gramStart"/>
+      <w:r>
+        <w:rPr>
+          <w:rFonts w:ascii="Lucida Sans" w:hAnsi="Lucida Sans"/>
+          <w:lang w:val="en-US"/>
+        </w:rPr>
+        <w:t>inputArray</w:t>
+      </w:r>
+      <w:proofErr w:type="spellEnd"/>
+      <w:r>
+        <w:rPr>
+          <w:rFonts w:ascii="Lucida Sans" w:hAnsi="Lucida Sans"/>
+          <w:lang w:val="en-US"/>
+        </w:rPr>
+        <w:t>(</w:t>
+      </w:r>
+      <w:proofErr w:type="gramEnd"/>
+      <w:r>
+        <w:rPr>
+          <w:rFonts w:ascii="Lucida Sans" w:hAnsi="Lucida Sans"/>
+          <w:lang w:val="en-US"/>
+        </w:rPr>
+        <w:t>arr_2, n2);</w:t>
+      </w:r>
+    </w:p>
+    <w:p>
+      <w:pPr>
+        <w:spacing w:after="0"/>
+        <w:rPr>
+          <w:rFonts w:ascii="Lucida Sans" w:hAnsi="Lucida Sans"/>
+          <w:lang w:val="en-US"/>
+        </w:rPr>
+      </w:pPr>
+    </w:p>
+    <w:p>
+      <w:pPr>
+        <w:spacing w:after="0"/>
+        <w:rPr>
+          <w:rFonts w:ascii="Lucida Sans" w:hAnsi="Lucida Sans"/>
+          <w:lang w:val="en-US"/>
+        </w:rPr>
+      </w:pPr>
+      <w:r>
+        <w:rPr>
+          <w:rFonts w:ascii="Lucida Sans" w:hAnsi="Lucida Sans"/>
+          <w:lang w:val="en-US"/>
+        </w:rPr>
+        <w:t xml:space="preserve">    </w:t>
+      </w:r>
+      <w:proofErr w:type="spellStart"/>
+      <w:proofErr w:type="gramStart"/>
+      <w:r>
+        <w:rPr>
+          <w:rFonts w:ascii="Lucida Sans" w:hAnsi="Lucida Sans"/>
+          <w:lang w:val="en-US"/>
+        </w:rPr>
+        <w:t>printf</w:t>
+      </w:r>
+      <w:proofErr w:type="spellEnd"/>
+      <w:r>
+        <w:rPr>
+          <w:rFonts w:ascii="Lucida Sans" w:hAnsi="Lucida Sans"/>
+          <w:lang w:val="en-US"/>
+        </w:rPr>
+        <w:t>(</w:t>
+      </w:r>
+      <w:proofErr w:type="gramEnd"/>
+      <w:r>
+        <w:rPr>
+          <w:rFonts w:ascii="Lucida Sans" w:hAnsi="Lucida Sans"/>
+          <w:lang w:val="en-US"/>
+        </w:rPr>
+        <w:t>"\</w:t>
+      </w:r>
+      <w:proofErr w:type="spellStart"/>
+      <w:r>
+        <w:rPr>
+          <w:rFonts w:ascii="Lucida Sans" w:hAnsi="Lucida Sans"/>
+          <w:lang w:val="en-US"/>
+        </w:rPr>
+        <w:t>ninitial</w:t>
+      </w:r>
+      <w:proofErr w:type="spellEnd"/>
+      <w:r>
+        <w:rPr>
+          <w:rFonts w:ascii="Lucida Sans" w:hAnsi="Lucida Sans"/>
+          <w:lang w:val="en-US"/>
+        </w:rPr>
+        <w:t xml:space="preserve"> arrays are: \n");</w:t>
+      </w:r>
+    </w:p>
+    <w:p>
+      <w:pPr>
+        <w:spacing w:after="0"/>
+        <w:rPr>
+          <w:rFonts w:ascii="Lucida Sans" w:hAnsi="Lucida Sans"/>
+          <w:lang w:val="en-US"/>
+        </w:rPr>
+      </w:pPr>
+      <w:r>
+        <w:rPr>
+          <w:rFonts w:ascii="Lucida Sans" w:hAnsi="Lucida Sans"/>
+          <w:lang w:val="en-US"/>
+        </w:rPr>
+        <w:t xml:space="preserve">    </w:t>
+      </w:r>
+      <w:proofErr w:type="spellStart"/>
+      <w:proofErr w:type="gramStart"/>
+      <w:r>
+        <w:rPr>
+          <w:rFonts w:ascii="Lucida Sans" w:hAnsi="Lucida Sans"/>
+          <w:lang w:val="en-US"/>
+        </w:rPr>
+        <w:t>printArray</w:t>
+      </w:r>
+      <w:proofErr w:type="spellEnd"/>
+      <w:r>
+        <w:rPr>
+          <w:rFonts w:ascii="Lucida Sans" w:hAnsi="Lucida Sans"/>
+          <w:lang w:val="en-US"/>
+        </w:rPr>
+        <w:t>(</w:t>
+      </w:r>
+      <w:proofErr w:type="gramEnd"/>
+      <w:r>
+        <w:rPr>
+          <w:rFonts w:ascii="Lucida Sans" w:hAnsi="Lucida Sans"/>
+          <w:lang w:val="en-US"/>
+        </w:rPr>
+        <w:t>arr_1, n1);</w:t>
+      </w:r>
+    </w:p>
+    <w:p>
+      <w:pPr>
+        <w:spacing w:after="0"/>
+        <w:rPr>
+          <w:rFonts w:ascii="Lucida Sans" w:hAnsi="Lucida Sans"/>
+          <w:lang w:val="en-US"/>
+        </w:rPr>
+      </w:pPr>
+      <w:r>
+        <w:rPr>
+          <w:rFonts w:ascii="Lucida Sans" w:hAnsi="Lucida Sans"/>
+          <w:lang w:val="en-US"/>
+        </w:rPr>
+        <w:t xml:space="preserve">    </w:t>
+      </w:r>
+      <w:proofErr w:type="spellStart"/>
+      <w:r>
+        <w:rPr>
+          <w:rFonts w:ascii="Lucida Sans" w:hAnsi="Lucida Sans"/>
+          <w:lang w:val="en-US"/>
+        </w:rPr>
+        <w:t>printf</w:t>
+      </w:r>
+      <w:proofErr w:type="spellEnd"/>
+      <w:r>
+        <w:rPr>
+          <w:rFonts w:ascii="Lucida Sans" w:hAnsi="Lucida Sans"/>
+          <w:lang w:val="en-US"/>
+        </w:rPr>
+        <w:t>("\n");</w:t>
+      </w:r>
+    </w:p>
+    <w:p>
+      <w:pPr>
+        <w:spacing w:after="0"/>
+        <w:rPr>
+          <w:rFonts w:ascii="Lucida Sans" w:hAnsi="Lucida Sans"/>
+          <w:lang w:val="en-US"/>
+        </w:rPr>
+      </w:pPr>
+      <w:r>
+        <w:rPr>
+          <w:rFonts w:ascii="Lucida Sans" w:hAnsi="Lucida Sans"/>
+          <w:lang w:val="en-US"/>
+        </w:rPr>
+        <w:t xml:space="preserve">    </w:t>
+      </w:r>
+      <w:proofErr w:type="spellStart"/>
+      <w:proofErr w:type="gramStart"/>
+      <w:r>
+        <w:rPr>
+          <w:rFonts w:ascii="Lucida Sans" w:hAnsi="Lucida Sans"/>
+          <w:lang w:val="en-US"/>
+        </w:rPr>
+        <w:t>printArray</w:t>
+      </w:r>
+      <w:proofErr w:type="spellEnd"/>
+      <w:r>
+        <w:rPr>
+          <w:rFonts w:ascii="Lucida Sans" w:hAnsi="Lucida Sans"/>
+          <w:lang w:val="en-US"/>
+        </w:rPr>
+        <w:t>(</w:t>
+      </w:r>
+      <w:proofErr w:type="gramEnd"/>
+      <w:r>
+        <w:rPr>
+          <w:rFonts w:ascii="Lucida Sans" w:hAnsi="Lucida Sans"/>
+          <w:lang w:val="en-US"/>
+        </w:rPr>
+        <w:t>arr_2, n2);</w:t>
+      </w:r>
+    </w:p>
+    <w:p>
+      <w:pPr>
+        <w:spacing w:after="0"/>
+        <w:rPr>
+          <w:rFonts w:ascii="Lucida Sans" w:hAnsi="Lucida Sans"/>
+          <w:lang w:val="en-US"/>
+        </w:rPr>
+      </w:pPr>
+    </w:p>
+    <w:p>
+      <w:pPr>
+        <w:spacing w:after="0"/>
+        <w:rPr>
+          <w:rFonts w:ascii="Lucida Sans" w:hAnsi="Lucida Sans"/>
+          <w:lang w:val="en-US"/>
+        </w:rPr>
+      </w:pPr>
+      <w:r>
+        <w:rPr>
+          <w:rFonts w:ascii="Lucida Sans" w:hAnsi="Lucida Sans"/>
+          <w:lang w:val="en-US"/>
+        </w:rPr>
+        <w:t xml:space="preserve">    int </w:t>
+      </w:r>
+      <w:proofErr w:type="gramStart"/>
+      <w:r>
+        <w:rPr>
+          <w:rFonts w:ascii="Lucida Sans" w:hAnsi="Lucida Sans"/>
+          <w:lang w:val="en-US"/>
+        </w:rPr>
+        <w:t>merge[</w:t>
+      </w:r>
+      <w:proofErr w:type="gramEnd"/>
+      <w:r>
+        <w:rPr>
+          <w:rFonts w:ascii="Lucida Sans" w:hAnsi="Lucida Sans"/>
+          <w:lang w:val="en-US"/>
+        </w:rPr>
+        <w:t>n1 + n2];</w:t>
+      </w:r>
+    </w:p>
+    <w:p>
+      <w:pPr>
+        <w:spacing w:after="0"/>
+        <w:rPr>
+          <w:rFonts w:ascii="Lucida Sans" w:hAnsi="Lucida Sans"/>
+          <w:lang w:val="en-US"/>
+        </w:rPr>
+      </w:pPr>
+    </w:p>
+    <w:p>
+      <w:pPr>
+        <w:spacing w:after="0"/>
+        <w:rPr>
+          <w:rFonts w:ascii="Lucida Sans" w:hAnsi="Lucida Sans"/>
+          <w:lang w:val="en-US"/>
+        </w:rPr>
+      </w:pPr>
+      <w:r>
+        <w:rPr>
+          <w:rFonts w:ascii="Lucida Sans" w:hAnsi="Lucida Sans"/>
+          <w:lang w:val="en-US"/>
+        </w:rPr>
+        <w:t xml:space="preserve">    </w:t>
+      </w:r>
+      <w:proofErr w:type="gramStart"/>
+      <w:r>
+        <w:rPr>
+          <w:rFonts w:ascii="Lucida Sans" w:hAnsi="Lucida Sans"/>
+          <w:lang w:val="en-US"/>
+        </w:rPr>
+        <w:t>for(</w:t>
+      </w:r>
+      <w:proofErr w:type="spellStart"/>
+      <w:proofErr w:type="gramEnd"/>
+      <w:r>
+        <w:rPr>
+          <w:rFonts w:ascii="Lucida Sans" w:hAnsi="Lucida Sans"/>
+          <w:lang w:val="en-US"/>
+        </w:rPr>
+        <w:t>i</w:t>
+      </w:r>
+      <w:proofErr w:type="spellEnd"/>
+      <w:r>
+        <w:rPr>
+          <w:rFonts w:ascii="Lucida Sans" w:hAnsi="Lucida Sans"/>
+          <w:lang w:val="en-US"/>
+        </w:rPr>
+        <w:t xml:space="preserve"> = 0; </w:t>
+      </w:r>
+      <w:proofErr w:type="spellStart"/>
+      <w:r>
+        <w:rPr>
+          <w:rFonts w:ascii="Lucida Sans" w:hAnsi="Lucida Sans"/>
+          <w:lang w:val="en-US"/>
+        </w:rPr>
+        <w:t>i</w:t>
+      </w:r>
+      <w:proofErr w:type="spellEnd"/>
+      <w:r>
+        <w:rPr>
+          <w:rFonts w:ascii="Lucida Sans" w:hAnsi="Lucida Sans"/>
+          <w:lang w:val="en-US"/>
+        </w:rPr>
+        <w:t xml:space="preserve"> &lt; n1; </w:t>
+      </w:r>
+      <w:proofErr w:type="spellStart"/>
+      <w:r>
+        <w:rPr>
+          <w:rFonts w:ascii="Lucida Sans" w:hAnsi="Lucida Sans"/>
+          <w:lang w:val="en-US"/>
+        </w:rPr>
+        <w:t>i</w:t>
+      </w:r>
+      <w:proofErr w:type="spellEnd"/>
+      <w:r>
+        <w:rPr>
+          <w:rFonts w:ascii="Lucida Sans" w:hAnsi="Lucida Sans"/>
+          <w:lang w:val="en-US"/>
+        </w:rPr>
+        <w:t>+</w:t>
+      </w:r>
+      <w:proofErr w:type="gramStart"/>
+      <w:r>
+        <w:rPr>
+          <w:rFonts w:ascii="Lucida Sans" w:hAnsi="Lucida Sans"/>
+          <w:lang w:val="en-US"/>
+        </w:rPr>
+        <w:t>+){</w:t>
+      </w:r>
+      <w:proofErr w:type="gramEnd"/>
+    </w:p>
+    <w:p>
+      <w:pPr>
+        <w:spacing w:after="0"/>
+        <w:rPr>
+          <w:rFonts w:ascii="Lucida Sans" w:hAnsi="Lucida Sans"/>
+          <w:lang w:val="en-US"/>
+        </w:rPr>
+      </w:pPr>
+      <w:r>
+        <w:rPr>
+          <w:rFonts w:ascii="Lucida Sans" w:hAnsi="Lucida Sans"/>
+          <w:lang w:val="en-US"/>
+        </w:rPr>
+        <w:t xml:space="preserve">        merge[</w:t>
+      </w:r>
+      <w:proofErr w:type="spellStart"/>
+      <w:r>
+        <w:rPr>
+          <w:rFonts w:ascii="Lucida Sans" w:hAnsi="Lucida Sans"/>
+          <w:lang w:val="en-US"/>
+        </w:rPr>
+        <w:t>i</w:t>
+      </w:r>
+      <w:proofErr w:type="spellEnd"/>
+      <w:r>
+        <w:rPr>
+          <w:rFonts w:ascii="Lucida Sans" w:hAnsi="Lucida Sans"/>
+          <w:lang w:val="en-US"/>
+        </w:rPr>
+        <w:t>] = arr_1[</w:t>
+      </w:r>
+      <w:proofErr w:type="spellStart"/>
+      <w:r>
+        <w:rPr>
+          <w:rFonts w:ascii="Lucida Sans" w:hAnsi="Lucida Sans"/>
+          <w:lang w:val="en-US"/>
+        </w:rPr>
+        <w:t>i</w:t>
+      </w:r>
+      <w:proofErr w:type="spellEnd"/>
+      <w:r>
+        <w:rPr>
+          <w:rFonts w:ascii="Lucida Sans" w:hAnsi="Lucida Sans"/>
+          <w:lang w:val="en-US"/>
+        </w:rPr>
+        <w:t>];</w:t>
+      </w:r>
+    </w:p>
+    <w:p>
+      <w:pPr>
+        <w:spacing w:after="0"/>
+        <w:rPr>
+          <w:rFonts w:ascii="Lucida Sans" w:hAnsi="Lucida Sans"/>
+          <w:lang w:val="en-US"/>
+        </w:rPr>
+      </w:pPr>
+      <w:r>
+        <w:rPr>
+          <w:rFonts w:ascii="Lucida Sans" w:hAnsi="Lucida Sans"/>
+          <w:lang w:val="en-US"/>
+        </w:rPr>
+        <w:t xml:space="preserve">    }</w:t>
+      </w:r>
+    </w:p>
+    <w:p>
+      <w:pPr>
+        <w:spacing w:after="0"/>
+        <w:rPr>
+          <w:rFonts w:ascii="Lucida Sans" w:hAnsi="Lucida Sans"/>
+          <w:lang w:val="en-US"/>
+        </w:rPr>
+      </w:pPr>
+      <w:r>
+        <w:rPr>
+          <w:rFonts w:ascii="Lucida Sans" w:hAnsi="Lucida Sans"/>
+          <w:lang w:val="en-US"/>
+        </w:rPr>
+        <w:t xml:space="preserve">    </w:t>
+      </w:r>
+      <w:proofErr w:type="gramStart"/>
+      <w:r>
+        <w:rPr>
+          <w:rFonts w:ascii="Lucida Sans" w:hAnsi="Lucida Sans"/>
+          <w:lang w:val="en-US"/>
+        </w:rPr>
+        <w:t>for(</w:t>
+      </w:r>
+      <w:proofErr w:type="spellStart"/>
+      <w:proofErr w:type="gramEnd"/>
+      <w:r>
+        <w:rPr>
+          <w:rFonts w:ascii="Lucida Sans" w:hAnsi="Lucida Sans"/>
+          <w:lang w:val="en-US"/>
+        </w:rPr>
+        <w:t>i</w:t>
+      </w:r>
+      <w:proofErr w:type="spellEnd"/>
+      <w:r>
+        <w:rPr>
+          <w:rFonts w:ascii="Lucida Sans" w:hAnsi="Lucida Sans"/>
+          <w:lang w:val="en-US"/>
+        </w:rPr>
+        <w:t xml:space="preserve"> = 0; </w:t>
+      </w:r>
+      <w:proofErr w:type="spellStart"/>
+      <w:r>
+        <w:rPr>
+          <w:rFonts w:ascii="Lucida Sans" w:hAnsi="Lucida Sans"/>
+          <w:lang w:val="en-US"/>
+        </w:rPr>
+        <w:t>i</w:t>
+      </w:r>
+      <w:proofErr w:type="spellEnd"/>
+      <w:r>
+        <w:rPr>
+          <w:rFonts w:ascii="Lucida Sans" w:hAnsi="Lucida Sans"/>
+          <w:lang w:val="en-US"/>
+        </w:rPr>
+        <w:t xml:space="preserve"> &lt; n2; </w:t>
+      </w:r>
+      <w:proofErr w:type="spellStart"/>
+      <w:r>
+        <w:rPr>
+          <w:rFonts w:ascii="Lucida Sans" w:hAnsi="Lucida Sans"/>
+          <w:lang w:val="en-US"/>
+        </w:rPr>
+        <w:t>i</w:t>
+      </w:r>
+      <w:proofErr w:type="spellEnd"/>
+      <w:r>
+        <w:rPr>
+          <w:rFonts w:ascii="Lucida Sans" w:hAnsi="Lucida Sans"/>
+          <w:lang w:val="en-US"/>
+        </w:rPr>
+        <w:t>+</w:t>
+      </w:r>
+      <w:proofErr w:type="gramStart"/>
+      <w:r>
+        <w:rPr>
+          <w:rFonts w:ascii="Lucida Sans" w:hAnsi="Lucida Sans"/>
+          <w:lang w:val="en-US"/>
+        </w:rPr>
+        <w:t>+){</w:t>
+      </w:r>
+      <w:proofErr w:type="gramEnd"/>
+    </w:p>
+    <w:p>
+      <w:pPr>
+        <w:spacing w:after="0"/>
+        <w:rPr>
+          <w:rFonts w:ascii="Lucida Sans" w:hAnsi="Lucida Sans"/>
+          <w:lang w:val="en-US"/>
+        </w:rPr>
+      </w:pPr>
+      <w:r>
+        <w:rPr>
+          <w:rFonts w:ascii="Lucida Sans" w:hAnsi="Lucida Sans"/>
+          <w:lang w:val="en-US"/>
+        </w:rPr>
+        <w:t xml:space="preserve">        </w:t>
+      </w:r>
+      <w:proofErr w:type="gramStart"/>
+      <w:r>
+        <w:rPr>
+          <w:rFonts w:ascii="Lucida Sans" w:hAnsi="Lucida Sans"/>
+          <w:lang w:val="en-US"/>
+        </w:rPr>
+        <w:t>merge[</w:t>
+      </w:r>
+      <w:proofErr w:type="gramEnd"/>
+      <w:r>
+        <w:rPr>
+          <w:rFonts w:ascii="Lucida Sans" w:hAnsi="Lucida Sans"/>
+          <w:lang w:val="en-US"/>
+        </w:rPr>
+        <w:t xml:space="preserve">n1 + </w:t>
+      </w:r>
+      <w:proofErr w:type="spellStart"/>
+      <w:r>
+        <w:rPr>
+          <w:rFonts w:ascii="Lucida Sans" w:hAnsi="Lucida Sans"/>
+          <w:lang w:val="en-US"/>
+        </w:rPr>
+        <w:t>i</w:t>
+      </w:r>
+      <w:proofErr w:type="spellEnd"/>
+      <w:r>
+        <w:rPr>
+          <w:rFonts w:ascii="Lucida Sans" w:hAnsi="Lucida Sans"/>
+          <w:lang w:val="en-US"/>
+        </w:rPr>
+        <w:t>] = arr_2[</w:t>
+      </w:r>
+      <w:proofErr w:type="spellStart"/>
+      <w:r>
+        <w:rPr>
+          <w:rFonts w:ascii="Lucida Sans" w:hAnsi="Lucida Sans"/>
+          <w:lang w:val="en-US"/>
+        </w:rPr>
+        <w:t>i</w:t>
+      </w:r>
+      <w:proofErr w:type="spellEnd"/>
+      <w:r>
+        <w:rPr>
+          <w:rFonts w:ascii="Lucida Sans" w:hAnsi="Lucida Sans"/>
+          <w:lang w:val="en-US"/>
+        </w:rPr>
+        <w:t>];</w:t>
+      </w:r>
+    </w:p>
+    <w:p>
+      <w:pPr>
+        <w:spacing w:after="0"/>
+        <w:rPr>
+          <w:rFonts w:ascii="Lucida Sans" w:hAnsi="Lucida Sans"/>
+          <w:lang w:val="en-US"/>
+        </w:rPr>
+      </w:pPr>
+      <w:r>
+        <w:rPr>
+          <w:rFonts w:ascii="Lucida Sans" w:hAnsi="Lucida Sans"/>
+          <w:lang w:val="en-US"/>
+        </w:rPr>
+        <w:t xml:space="preserve">    }</w:t>
+      </w:r>
+    </w:p>
+    <w:p>
+      <w:pPr>
+        <w:spacing w:after="0"/>
+        <w:rPr>
+          <w:rFonts w:ascii="Lucida Sans" w:hAnsi="Lucida Sans"/>
+          <w:lang w:val="en-US"/>
+        </w:rPr>
+      </w:pPr>
+    </w:p>
+    <w:p>
+      <w:pPr>
+        <w:spacing w:after="0"/>
+        <w:rPr>
+          <w:rFonts w:ascii="Lucida Sans" w:hAnsi="Lucida Sans"/>
+          <w:lang w:val="en-US"/>
+        </w:rPr>
+      </w:pPr>
+    </w:p>
+    <w:p>
+      <w:pPr>
+        <w:spacing w:after="0"/>
+        <w:rPr>
+          <w:rFonts w:ascii="Lucida Sans" w:hAnsi="Lucida Sans"/>
+          <w:lang w:val="en-US"/>
+        </w:rPr>
+      </w:pPr>
+      <w:r>
+        <w:rPr>
+          <w:rFonts w:ascii="Lucida Sans" w:hAnsi="Lucida Sans"/>
+          <w:lang w:val="en-US"/>
+        </w:rPr>
+        <w:t xml:space="preserve">    </w:t>
+      </w:r>
+      <w:proofErr w:type="spellStart"/>
+      <w:proofErr w:type="gramStart"/>
+      <w:r>
+        <w:rPr>
+          <w:rFonts w:ascii="Lucida Sans" w:hAnsi="Lucida Sans"/>
+          <w:lang w:val="en-US"/>
+        </w:rPr>
+        <w:t>printf</w:t>
+      </w:r>
+      <w:proofErr w:type="spellEnd"/>
+      <w:r>
+        <w:rPr>
+          <w:rFonts w:ascii="Lucida Sans" w:hAnsi="Lucida Sans"/>
+          <w:lang w:val="en-US"/>
+        </w:rPr>
+        <w:t>(</w:t>
+      </w:r>
+      <w:proofErr w:type="gramEnd"/>
+      <w:r>
+        <w:rPr>
+          <w:rFonts w:ascii="Lucida Sans" w:hAnsi="Lucida Sans"/>
+          <w:lang w:val="en-US"/>
+        </w:rPr>
+        <w:t>"\</w:t>
+      </w:r>
+      <w:proofErr w:type="spellStart"/>
+      <w:proofErr w:type="gramStart"/>
+      <w:r>
+        <w:rPr>
+          <w:rFonts w:ascii="Lucida Sans" w:hAnsi="Lucida Sans"/>
+          <w:lang w:val="en-US"/>
+        </w:rPr>
+        <w:t>nUnion</w:t>
+      </w:r>
+      <w:proofErr w:type="spellEnd"/>
+      <w:r>
+        <w:rPr>
+          <w:rFonts w:ascii="Lucida Sans" w:hAnsi="Lucida Sans"/>
+          <w:lang w:val="en-US"/>
+        </w:rPr>
+        <w:t xml:space="preserve"> :</w:t>
+      </w:r>
+      <w:proofErr w:type="gramEnd"/>
+      <w:r>
+        <w:rPr>
+          <w:rFonts w:ascii="Lucida Sans" w:hAnsi="Lucida Sans"/>
+          <w:lang w:val="en-US"/>
+        </w:rPr>
+        <w:t xml:space="preserve"> ");</w:t>
+      </w:r>
+    </w:p>
+    <w:p>
+      <w:pPr>
+        <w:spacing w:after="0"/>
+        <w:rPr>
+          <w:rFonts w:ascii="Lucida Sans" w:hAnsi="Lucida Sans"/>
+          <w:lang w:val="en-US"/>
+        </w:rPr>
+      </w:pPr>
+      <w:r>
+        <w:rPr>
+          <w:rFonts w:ascii="Lucida Sans" w:hAnsi="Lucida Sans"/>
+          <w:lang w:val="en-US"/>
+        </w:rPr>
+        <w:t xml:space="preserve">    </w:t>
+      </w:r>
+      <w:proofErr w:type="spellStart"/>
+      <w:proofErr w:type="gramStart"/>
+      <w:r>
+        <w:rPr>
+          <w:rFonts w:ascii="Lucida Sans" w:hAnsi="Lucida Sans"/>
+          <w:lang w:val="en-US"/>
+        </w:rPr>
+        <w:t>printArray</w:t>
+      </w:r>
+      <w:proofErr w:type="spellEnd"/>
+      <w:r>
+        <w:rPr>
+          <w:rFonts w:ascii="Lucida Sans" w:hAnsi="Lucida Sans"/>
+          <w:lang w:val="en-US"/>
+        </w:rPr>
+        <w:t>(</w:t>
+      </w:r>
+      <w:proofErr w:type="gramEnd"/>
+      <w:r>
+        <w:rPr>
+          <w:rFonts w:ascii="Lucida Sans" w:hAnsi="Lucida Sans"/>
+          <w:lang w:val="en-US"/>
+        </w:rPr>
+        <w:t>merge, n1+n2);</w:t>
+      </w:r>
+    </w:p>
+    <w:p>
+      <w:pPr>
+        <w:spacing w:after="0"/>
+        <w:rPr>
+          <w:rFonts w:ascii="Lucida Sans" w:hAnsi="Lucida Sans"/>
+          <w:lang w:val="en-US"/>
+        </w:rPr>
+      </w:pPr>
+    </w:p>
+    <w:p>
+      <w:pPr>
+        <w:spacing w:after="0"/>
+        <w:rPr>
+          <w:rFonts w:ascii="Lucida Sans" w:hAnsi="Lucida Sans"/>
+          <w:lang w:val="en-US"/>
+        </w:rPr>
+      </w:pPr>
+      <w:r>
+        <w:rPr>
+          <w:rFonts w:ascii="Lucida Sans" w:hAnsi="Lucida Sans"/>
+          <w:lang w:val="en-US"/>
+        </w:rPr>
+        <w:t xml:space="preserve">    int </w:t>
+      </w:r>
+      <w:proofErr w:type="gramStart"/>
+      <w:r>
+        <w:rPr>
+          <w:rFonts w:ascii="Lucida Sans" w:hAnsi="Lucida Sans"/>
+          <w:lang w:val="en-US"/>
+        </w:rPr>
+        <w:t>inter[</w:t>
+      </w:r>
+      <w:proofErr w:type="gramEnd"/>
+      <w:r>
+        <w:rPr>
+          <w:rFonts w:ascii="Lucida Sans" w:hAnsi="Lucida Sans"/>
+          <w:lang w:val="en-US"/>
+        </w:rPr>
+        <w:t>n1 &gt; n</w:t>
+      </w:r>
+      <w:proofErr w:type="gramStart"/>
+      <w:r>
+        <w:rPr>
+          <w:rFonts w:ascii="Lucida Sans" w:hAnsi="Lucida Sans"/>
+          <w:lang w:val="en-US"/>
+        </w:rPr>
+        <w:t>2 ?</w:t>
+      </w:r>
+      <w:proofErr w:type="gramEnd"/>
+      <w:r>
+        <w:rPr>
+          <w:rFonts w:ascii="Lucida Sans" w:hAnsi="Lucida Sans"/>
+          <w:lang w:val="en-US"/>
+        </w:rPr>
+        <w:t xml:space="preserve"> n</w:t>
+      </w:r>
+      <w:proofErr w:type="gramStart"/>
+      <w:r>
+        <w:rPr>
+          <w:rFonts w:ascii="Lucida Sans" w:hAnsi="Lucida Sans"/>
+          <w:lang w:val="en-US"/>
+        </w:rPr>
+        <w:t>1 :</w:t>
+      </w:r>
+      <w:proofErr w:type="gramEnd"/>
+      <w:r>
+        <w:rPr>
+          <w:rFonts w:ascii="Lucida Sans" w:hAnsi="Lucida Sans"/>
+          <w:lang w:val="en-US"/>
+        </w:rPr>
+        <w:t xml:space="preserve"> n2];</w:t>
+      </w:r>
+    </w:p>
+    <w:p>
+      <w:pPr>
+        <w:spacing w:after="0"/>
+        <w:rPr>
+          <w:rFonts w:ascii="Lucida Sans" w:hAnsi="Lucida Sans"/>
+          <w:lang w:val="en-US"/>
+        </w:rPr>
+      </w:pPr>
+      <w:r>
+        <w:rPr>
+          <w:rFonts w:ascii="Lucida Sans" w:hAnsi="Lucida Sans"/>
+          <w:lang w:val="en-US"/>
+        </w:rPr>
+        <w:t xml:space="preserve">    int k = 0;</w:t>
+      </w:r>
+    </w:p>
+    <w:p>
+      <w:pPr>
+        <w:spacing w:after="0"/>
+        <w:rPr>
+          <w:rFonts w:ascii="Lucida Sans" w:hAnsi="Lucida Sans"/>
+          <w:lang w:val="en-US"/>
+        </w:rPr>
+      </w:pPr>
+    </w:p>
+    <w:p>
+      <w:pPr>
+        <w:spacing w:after="0"/>
+        <w:rPr>
+          <w:rFonts w:ascii="Lucida Sans" w:hAnsi="Lucida Sans"/>
+          <w:lang w:val="en-US"/>
+        </w:rPr>
+      </w:pPr>
+      <w:r>
+        <w:rPr>
+          <w:rFonts w:ascii="Lucida Sans" w:hAnsi="Lucida Sans"/>
+          <w:lang w:val="en-US"/>
+        </w:rPr>
+        <w:lastRenderedPageBreak/>
+        <w:t xml:space="preserve">    </w:t>
+      </w:r>
+      <w:proofErr w:type="gramStart"/>
+      <w:r>
+        <w:rPr>
+          <w:rFonts w:ascii="Lucida Sans" w:hAnsi="Lucida Sans"/>
+          <w:lang w:val="en-US"/>
+        </w:rPr>
+        <w:t>for(</w:t>
+      </w:r>
+      <w:proofErr w:type="spellStart"/>
+      <w:proofErr w:type="gramEnd"/>
+      <w:r>
+        <w:rPr>
+          <w:rFonts w:ascii="Lucida Sans" w:hAnsi="Lucida Sans"/>
+          <w:lang w:val="en-US"/>
+        </w:rPr>
+        <w:t>i</w:t>
+      </w:r>
+      <w:proofErr w:type="spellEnd"/>
+      <w:r>
+        <w:rPr>
+          <w:rFonts w:ascii="Lucida Sans" w:hAnsi="Lucida Sans"/>
+          <w:lang w:val="en-US"/>
+        </w:rPr>
+        <w:t xml:space="preserve"> = 0; </w:t>
+      </w:r>
+      <w:proofErr w:type="spellStart"/>
+      <w:r>
+        <w:rPr>
+          <w:rFonts w:ascii="Lucida Sans" w:hAnsi="Lucida Sans"/>
+          <w:lang w:val="en-US"/>
+        </w:rPr>
+        <w:t>i</w:t>
+      </w:r>
+      <w:proofErr w:type="spellEnd"/>
+      <w:r>
+        <w:rPr>
+          <w:rFonts w:ascii="Lucida Sans" w:hAnsi="Lucida Sans"/>
+          <w:lang w:val="en-US"/>
+        </w:rPr>
+        <w:t xml:space="preserve"> &lt; n1; </w:t>
+      </w:r>
+      <w:proofErr w:type="spellStart"/>
+      <w:r>
+        <w:rPr>
+          <w:rFonts w:ascii="Lucida Sans" w:hAnsi="Lucida Sans"/>
+          <w:lang w:val="en-US"/>
+        </w:rPr>
+        <w:t>i</w:t>
+      </w:r>
+      <w:proofErr w:type="spellEnd"/>
+      <w:r>
+        <w:rPr>
+          <w:rFonts w:ascii="Lucida Sans" w:hAnsi="Lucida Sans"/>
+          <w:lang w:val="en-US"/>
+        </w:rPr>
+        <w:t xml:space="preserve"> +</w:t>
+      </w:r>
+      <w:proofErr w:type="gramStart"/>
+      <w:r>
+        <w:rPr>
+          <w:rFonts w:ascii="Lucida Sans" w:hAnsi="Lucida Sans"/>
+          <w:lang w:val="en-US"/>
+        </w:rPr>
+        <w:t>+){</w:t>
+      </w:r>
+      <w:proofErr w:type="gramEnd"/>
+    </w:p>
+    <w:p>
+      <w:pPr>
+        <w:spacing w:after="0"/>
+        <w:rPr>
+          <w:rFonts w:ascii="Lucida Sans" w:hAnsi="Lucida Sans"/>
+          <w:lang w:val="en-US"/>
+        </w:rPr>
+      </w:pPr>
+      <w:r>
+        <w:rPr>
+          <w:rFonts w:ascii="Lucida Sans" w:hAnsi="Lucida Sans"/>
+          <w:lang w:val="en-US"/>
+        </w:rPr>
+        <w:t xml:space="preserve">        check = 0;</w:t>
+      </w:r>
+    </w:p>
+    <w:p>
+      <w:pPr>
+        <w:spacing w:after="0"/>
+        <w:rPr>
+          <w:rFonts w:ascii="Lucida Sans" w:hAnsi="Lucida Sans"/>
+          <w:lang w:val="en-US"/>
+        </w:rPr>
+      </w:pPr>
+    </w:p>
+    <w:p>
+      <w:pPr>
+        <w:spacing w:after="0"/>
+        <w:rPr>
+          <w:rFonts w:ascii="Lucida Sans" w:hAnsi="Lucida Sans"/>
+          <w:lang w:val="en-US"/>
+        </w:rPr>
+      </w:pPr>
+      <w:r>
+        <w:rPr>
+          <w:rFonts w:ascii="Lucida Sans" w:hAnsi="Lucida Sans"/>
+          <w:lang w:val="en-US"/>
+        </w:rPr>
+        <w:t xml:space="preserve">        </w:t>
+      </w:r>
+      <w:proofErr w:type="gramStart"/>
+      <w:r>
+        <w:rPr>
+          <w:rFonts w:ascii="Lucida Sans" w:hAnsi="Lucida Sans"/>
+          <w:lang w:val="en-US"/>
+        </w:rPr>
+        <w:t>for(</w:t>
+      </w:r>
+      <w:proofErr w:type="gramEnd"/>
+      <w:r>
+        <w:rPr>
+          <w:rFonts w:ascii="Lucida Sans" w:hAnsi="Lucida Sans"/>
+          <w:lang w:val="en-US"/>
+        </w:rPr>
+        <w:t xml:space="preserve">j = 0; j &lt; n2; </w:t>
+      </w:r>
+      <w:proofErr w:type="spellStart"/>
+      <w:proofErr w:type="gramStart"/>
+      <w:r>
+        <w:rPr>
+          <w:rFonts w:ascii="Lucida Sans" w:hAnsi="Lucida Sans"/>
+          <w:lang w:val="en-US"/>
+        </w:rPr>
+        <w:t>j++</w:t>
+      </w:r>
+      <w:proofErr w:type="spellEnd"/>
+      <w:r>
+        <w:rPr>
+          <w:rFonts w:ascii="Lucida Sans" w:hAnsi="Lucida Sans"/>
+          <w:lang w:val="en-US"/>
+        </w:rPr>
+        <w:t>){</w:t>
+      </w:r>
+      <w:proofErr w:type="gramEnd"/>
+    </w:p>
+    <w:p>
+      <w:pPr>
+        <w:spacing w:after="0"/>
+        <w:rPr>
+          <w:rFonts w:ascii="Lucida Sans" w:hAnsi="Lucida Sans"/>
+          <w:lang w:val="en-US"/>
+        </w:rPr>
+      </w:pPr>
+      <w:r>
+        <w:rPr>
+          <w:rFonts w:ascii="Lucida Sans" w:hAnsi="Lucida Sans"/>
+          <w:lang w:val="en-US"/>
+        </w:rPr>
+        <w:t xml:space="preserve">            if(arr_1[</w:t>
+      </w:r>
+      <w:proofErr w:type="spellStart"/>
+      <w:r>
+        <w:rPr>
+          <w:rFonts w:ascii="Lucida Sans" w:hAnsi="Lucida Sans"/>
+          <w:lang w:val="en-US"/>
+        </w:rPr>
+        <w:t>i</w:t>
+      </w:r>
+      <w:proofErr w:type="spellEnd"/>
+      <w:r>
+        <w:rPr>
+          <w:rFonts w:ascii="Lucida Sans" w:hAnsi="Lucida Sans"/>
+          <w:lang w:val="en-US"/>
+        </w:rPr>
+        <w:t>] == arr_2[j</w:t>
+      </w:r>
+      <w:proofErr w:type="gramStart"/>
+      <w:r>
+        <w:rPr>
+          <w:rFonts w:ascii="Lucida Sans" w:hAnsi="Lucida Sans"/>
+          <w:lang w:val="en-US"/>
+        </w:rPr>
+        <w:t>]){</w:t>
+      </w:r>
+      <w:proofErr w:type="gramEnd"/>
+    </w:p>
+    <w:p>
+      <w:pPr>
+        <w:spacing w:after="0"/>
+        <w:rPr>
+          <w:rFonts w:ascii="Lucida Sans" w:hAnsi="Lucida Sans"/>
+          <w:lang w:val="en-US"/>
+        </w:rPr>
+      </w:pPr>
+      <w:r>
+        <w:rPr>
+          <w:rFonts w:ascii="Lucida Sans" w:hAnsi="Lucida Sans"/>
+          <w:lang w:val="en-US"/>
+        </w:rPr>
+        <w:t xml:space="preserve">                check = 1;</w:t>
+      </w:r>
+    </w:p>
+    <w:p>
+      <w:pPr>
+        <w:spacing w:after="0"/>
+        <w:rPr>
+          <w:rFonts w:ascii="Lucida Sans" w:hAnsi="Lucida Sans"/>
+          <w:lang w:val="en-US"/>
+        </w:rPr>
+      </w:pPr>
+      <w:r>
+        <w:rPr>
+          <w:rFonts w:ascii="Lucida Sans" w:hAnsi="Lucida Sans"/>
+          <w:lang w:val="en-US"/>
+        </w:rPr>
+        <w:t xml:space="preserve">                break;</w:t>
+      </w:r>
+    </w:p>
+    <w:p>
+      <w:pPr>
+        <w:spacing w:after="0"/>
+        <w:rPr>
+          <w:rFonts w:ascii="Lucida Sans" w:hAnsi="Lucida Sans"/>
+          <w:lang w:val="en-US"/>
+        </w:rPr>
+      </w:pPr>
+      <w:r>
+        <w:rPr>
+          <w:rFonts w:ascii="Lucida Sans" w:hAnsi="Lucida Sans"/>
+          <w:lang w:val="en-US"/>
+        </w:rPr>
+        <w:t xml:space="preserve">            }</w:t>
+      </w:r>
+    </w:p>
+    <w:p>
+      <w:pPr>
+        <w:spacing w:after="0"/>
+        <w:rPr>
+          <w:rFonts w:ascii="Lucida Sans" w:hAnsi="Lucida Sans"/>
+          <w:lang w:val="en-US"/>
+        </w:rPr>
+      </w:pPr>
+      <w:r>
+        <w:rPr>
+          <w:rFonts w:ascii="Lucida Sans" w:hAnsi="Lucida Sans"/>
+          <w:lang w:val="en-US"/>
+        </w:rPr>
+        <w:t xml:space="preserve">        }</w:t>
+      </w:r>
+    </w:p>
+    <w:p>
+      <w:pPr>
+        <w:spacing w:after="0"/>
+        <w:rPr>
+          <w:rFonts w:ascii="Lucida Sans" w:hAnsi="Lucida Sans"/>
+          <w:lang w:val="en-US"/>
+        </w:rPr>
+      </w:pPr>
+    </w:p>
+    <w:p>
+      <w:pPr>
+        <w:spacing w:after="0"/>
+        <w:rPr>
+          <w:rFonts w:ascii="Lucida Sans" w:hAnsi="Lucida Sans"/>
+          <w:lang w:val="en-US"/>
+        </w:rPr>
+      </w:pPr>
+      <w:r>
+        <w:rPr>
+          <w:rFonts w:ascii="Lucida Sans" w:hAnsi="Lucida Sans"/>
+          <w:lang w:val="en-US"/>
+        </w:rPr>
+        <w:t xml:space="preserve">        if(check</w:t>
+      </w:r>
+      <w:proofErr w:type="gramStart"/>
+      <w:r>
+        <w:rPr>
+          <w:rFonts w:ascii="Lucida Sans" w:hAnsi="Lucida Sans"/>
+          <w:lang w:val="en-US"/>
+        </w:rPr>
+        <w:t>){</w:t>
+      </w:r>
+      <w:proofErr w:type="gramEnd"/>
+    </w:p>
+    <w:p>
+      <w:pPr>
+        <w:spacing w:after="0"/>
+        <w:rPr>
+          <w:rFonts w:ascii="Lucida Sans" w:hAnsi="Lucida Sans"/>
+          <w:lang w:val="en-US"/>
+        </w:rPr>
+      </w:pPr>
+      <w:r>
+        <w:rPr>
+          <w:rFonts w:ascii="Lucida Sans" w:hAnsi="Lucida Sans"/>
+          <w:lang w:val="en-US"/>
+        </w:rPr>
+        <w:t xml:space="preserve">            inter[k] = arr_1[</w:t>
+      </w:r>
+      <w:proofErr w:type="spellStart"/>
+      <w:r>
+        <w:rPr>
+          <w:rFonts w:ascii="Lucida Sans" w:hAnsi="Lucida Sans"/>
+          <w:lang w:val="en-US"/>
+        </w:rPr>
+        <w:t>i</w:t>
+      </w:r>
+      <w:proofErr w:type="spellEnd"/>
+      <w:r>
+        <w:rPr>
+          <w:rFonts w:ascii="Lucida Sans" w:hAnsi="Lucida Sans"/>
+          <w:lang w:val="en-US"/>
+        </w:rPr>
+        <w:t>];</w:t>
+      </w:r>
+    </w:p>
+    <w:p>
+      <w:pPr>
+        <w:spacing w:after="0"/>
+        <w:rPr>
+          <w:rFonts w:ascii="Lucida Sans" w:hAnsi="Lucida Sans"/>
+          <w:lang w:val="en-US"/>
+        </w:rPr>
+      </w:pPr>
+      <w:r>
+        <w:rPr>
+          <w:rFonts w:ascii="Lucida Sans" w:hAnsi="Lucida Sans"/>
+          <w:lang w:val="en-US"/>
+        </w:rPr>
+        <w:t xml:space="preserve">            k++;</w:t>
+      </w:r>
+    </w:p>
+    <w:p>
+      <w:pPr>
+        <w:spacing w:after="0"/>
+        <w:rPr>
+          <w:rFonts w:ascii="Lucida Sans" w:hAnsi="Lucida Sans"/>
+          <w:lang w:val="en-US"/>
+        </w:rPr>
+      </w:pPr>
+      <w:r>
+        <w:rPr>
+          <w:rFonts w:ascii="Lucida Sans" w:hAnsi="Lucida Sans"/>
+          <w:lang w:val="en-US"/>
+        </w:rPr>
+        <w:t xml:space="preserve">        }</w:t>
+      </w:r>
+    </w:p>
+    <w:p>
+      <w:pPr>
+        <w:spacing w:after="0"/>
+        <w:rPr>
+          <w:rFonts w:ascii="Lucida Sans" w:hAnsi="Lucida Sans"/>
+          <w:lang w:val="en-US"/>
+        </w:rPr>
+      </w:pPr>
+      <w:r>
+        <w:rPr>
+          <w:rFonts w:ascii="Lucida Sans" w:hAnsi="Lucida Sans"/>
+          <w:lang w:val="en-US"/>
+        </w:rPr>
+        <w:t xml:space="preserve">    }</w:t>
+      </w:r>
+    </w:p>
+    <w:p>
+      <w:pPr>
+        <w:spacing w:after="0"/>
+        <w:rPr>
+          <w:rFonts w:ascii="Lucida Sans" w:hAnsi="Lucida Sans"/>
+          <w:lang w:val="en-US"/>
+        </w:rPr>
+      </w:pPr>
+    </w:p>
+    <w:p>
+      <w:pPr>
+        <w:spacing w:after="0"/>
+        <w:rPr>
+          <w:rFonts w:ascii="Lucida Sans" w:hAnsi="Lucida Sans"/>
+          <w:lang w:val="en-US"/>
+        </w:rPr>
+      </w:pPr>
+      <w:r>
+        <w:rPr>
+          <w:rFonts w:ascii="Lucida Sans" w:hAnsi="Lucida Sans"/>
+          <w:lang w:val="en-US"/>
+        </w:rPr>
+        <w:t xml:space="preserve">    </w:t>
+      </w:r>
+      <w:proofErr w:type="spellStart"/>
+      <w:proofErr w:type="gramStart"/>
+      <w:r>
+        <w:rPr>
+          <w:rFonts w:ascii="Lucida Sans" w:hAnsi="Lucida Sans"/>
+          <w:lang w:val="en-US"/>
+        </w:rPr>
+        <w:t>printf</w:t>
+      </w:r>
+      <w:proofErr w:type="spellEnd"/>
+      <w:r>
+        <w:rPr>
+          <w:rFonts w:ascii="Lucida Sans" w:hAnsi="Lucida Sans"/>
+          <w:lang w:val="en-US"/>
+        </w:rPr>
+        <w:t>(</w:t>
+      </w:r>
+      <w:proofErr w:type="gramEnd"/>
+      <w:r>
+        <w:rPr>
+          <w:rFonts w:ascii="Lucida Sans" w:hAnsi="Lucida Sans"/>
+          <w:lang w:val="en-US"/>
+        </w:rPr>
+        <w:t>"\</w:t>
+      </w:r>
+      <w:proofErr w:type="spellStart"/>
+      <w:proofErr w:type="gramStart"/>
+      <w:r>
+        <w:rPr>
+          <w:rFonts w:ascii="Lucida Sans" w:hAnsi="Lucida Sans"/>
+          <w:lang w:val="en-US"/>
+        </w:rPr>
+        <w:t>nintersection</w:t>
+      </w:r>
+      <w:proofErr w:type="spellEnd"/>
+      <w:r>
+        <w:rPr>
+          <w:rFonts w:ascii="Lucida Sans" w:hAnsi="Lucida Sans"/>
+          <w:lang w:val="en-US"/>
+        </w:rPr>
+        <w:t xml:space="preserve"> :</w:t>
+      </w:r>
+      <w:proofErr w:type="gramEnd"/>
+      <w:r>
+        <w:rPr>
+          <w:rFonts w:ascii="Lucida Sans" w:hAnsi="Lucida Sans"/>
+          <w:lang w:val="en-US"/>
+        </w:rPr>
+        <w:t xml:space="preserve"> ");</w:t>
+      </w:r>
+    </w:p>
+    <w:p>
+      <w:pPr>
+        <w:spacing w:after="0"/>
+        <w:rPr>
+          <w:rFonts w:ascii="Lucida Sans" w:hAnsi="Lucida Sans"/>
+          <w:lang w:val="en-US"/>
+        </w:rPr>
+      </w:pPr>
+      <w:r>
+        <w:rPr>
+          <w:rFonts w:ascii="Lucida Sans" w:hAnsi="Lucida Sans"/>
+          <w:lang w:val="en-US"/>
+        </w:rPr>
+        <w:t xml:space="preserve">    </w:t>
+      </w:r>
+      <w:proofErr w:type="spellStart"/>
+      <w:proofErr w:type="gramStart"/>
+      <w:r>
+        <w:rPr>
+          <w:rFonts w:ascii="Lucida Sans" w:hAnsi="Lucida Sans"/>
+          <w:lang w:val="en-US"/>
+        </w:rPr>
+        <w:t>printArray</w:t>
+      </w:r>
+      <w:proofErr w:type="spellEnd"/>
+      <w:r>
+        <w:rPr>
+          <w:rFonts w:ascii="Lucida Sans" w:hAnsi="Lucida Sans"/>
+          <w:lang w:val="en-US"/>
+        </w:rPr>
+        <w:t>(</w:t>
+      </w:r>
+      <w:proofErr w:type="gramEnd"/>
+      <w:r>
+        <w:rPr>
+          <w:rFonts w:ascii="Lucida Sans" w:hAnsi="Lucida Sans"/>
+          <w:lang w:val="en-US"/>
+        </w:rPr>
+        <w:t>inter, k);</w:t>
+      </w:r>
+    </w:p>
+    <w:p>
+      <w:pPr>
+        <w:spacing w:after="0"/>
+        <w:rPr>
+          <w:rFonts w:ascii="Lucida Sans" w:hAnsi="Lucida Sans"/>
+          <w:lang w:val="en-US"/>
+        </w:rPr>
+      </w:pPr>
+      <w:r>
+        <w:rPr>
+          <w:rFonts w:ascii="Lucida Sans" w:hAnsi="Lucida Sans"/>
+          <w:lang w:val="en-US"/>
+        </w:rPr>
+        <w:t>}</w:t>
+      </w:r>
+    </w:p>
+    <w:p>
+      <w:pPr>
+        <w:spacing w:after="0"/>
+        <w:rPr>
+          <w:rFonts w:ascii="Lucida Sans" w:hAnsi="Lucida Sans"/>
+          <w:lang w:val="en-US"/>
+        </w:rPr>
+      </w:pPr>
+      <w:r>
+        <w:rPr>
+          <w:rFonts w:ascii="Lucida Sans" w:hAnsi="Lucida Sans"/>
+          <w:lang w:val="en-US"/>
+        </w:rPr>
+        <w:lastRenderedPageBreak/>
+        <w:drawing>
+          <wp:inline distT="0" distB="0" distL="0" distR="0" wp14:anchorId="79895571" wp14:editId="4E1BDF7A">
+            <wp:extent cx="5731510" cy="5480050"/>
+            <wp:effectExtent l="0" t="0" r="0" b="6350"/>
+            <wp:docPr id="535888706" name="Picture 1"/>
+            <wp:cNvGraphicFramePr>
+              <a:graphicFrameLocks xmlns:a="http://schemas.openxmlformats.org/drawingml/2006/main" noChangeAspect="1"/>
+            </wp:cNvGraphicFramePr>
+            <a:graphic xmlns:a="http://schemas.openxmlformats.org/drawingml/2006/main">
+              <a:graphicData uri="http://schemas.openxmlformats.org/drawingml/2006/picture">
+                <pic:pic xmlns:pic="http://schemas.openxmlformats.org/drawingml/2006/picture">
+                  <pic:nvPicPr>
+                    <pic:cNvPr id="535888706" name=""/>
+                    <pic:cNvPicPr/>
+                  </pic:nvPicPr>
+                  <pic:blipFill>
+                    <a:blip r:embed="rId13"/>
+                    <a:stretch>
+                      <a:fillRect/>
+                    </a:stretch>
+                  </pic:blipFill>
+                  <pic:spPr>
+                    <a:xfrm>
+                      <a:off x="0" y="0"/>
+                      <a:ext cx="5731510" cy="5480050"/>
+                    </a:xfrm>
+                    <a:prstGeom prst="rect">
+                      <a:avLst/>
+                    </a:prstGeom>
+                  </pic:spPr>
+                </pic:pic>
+              </a:graphicData>
+            </a:graphic>
+          </wp:inline>
+        </w:drawing>
+      </w:r>
+    </w:p>
+    <w:p>
+      <w:pPr>
+        <w:spacing w:after="0"/>
+        <w:rPr>
+          <w:rFonts w:ascii="Lucida Sans" w:hAnsi="Lucida Sans"/>
+          <w:lang w:val="en-US"/>
+        </w:rPr>
+      </w:pPr>
+    </w:p>
+    <w:p>
+      <w:pPr>
+        <w:spacing w:after="0"/>
+        <w:rPr>
+          <w:rFonts w:ascii="Lucida Sans" w:hAnsi="Lucida Sans"/>
+          <w:lang w:val="en-US"/>
+        </w:rPr>
+      </w:pPr>
+    </w:p>
+    <w:p>
+      <w:pPr>
+        <w:spacing w:after="0"/>
+        <w:rPr>
+          <w:rFonts w:ascii="Lucida Sans" w:hAnsi="Lucida Sans"/>
+          <w:lang w:val="en-US"/>
+        </w:rPr>
+      </w:pPr>
+    </w:p>
+    <w:p>
+      <w:pPr>
+        <w:spacing w:after="0"/>
+        <w:rPr>
+          <w:rFonts w:ascii="Lucida Sans" w:hAnsi="Lucida Sans"/>
+          <w:lang w:val="en-US"/>
+        </w:rPr>
+      </w:pPr>
+    </w:p>
+    <w:p>
+      <w:pPr>
+        <w:spacing w:after="0"/>
+        <w:rPr>
+          <w:rFonts w:ascii="Lucida Sans" w:hAnsi="Lucida Sans"/>
+          <w:lang w:val="en-US"/>
+        </w:rPr>
+      </w:pPr>
+    </w:p>
+    <w:p>
+      <w:pPr>
+        <w:spacing w:after="0"/>
+        <w:rPr>
+          <w:rFonts w:ascii="Lucida Sans" w:hAnsi="Lucida Sans"/>
+          <w:lang w:val="en-US"/>
+        </w:rPr>
+      </w:pPr>
+    </w:p>
+    <w:p>
+      <w:pPr>
+        <w:spacing w:after="0"/>
+        <w:rPr>
+          <w:rFonts w:ascii="Lucida Sans" w:hAnsi="Lucida Sans"/>
+          <w:lang w:val="en-US"/>
+        </w:rPr>
+      </w:pPr>
+    </w:p>
+    <w:p>
+      <w:pPr>
+        <w:spacing w:after="0"/>
+        <w:rPr>
+          <w:rFonts w:ascii="Lucida Sans" w:hAnsi="Lucida Sans"/>
+          <w:lang w:val="en-US"/>
+        </w:rPr>
+      </w:pPr>
+    </w:p>
+    <w:p>
+      <w:pPr>
+        <w:spacing w:after="0"/>
+        <w:rPr>
+          <w:rFonts w:ascii="Lucida Sans" w:hAnsi="Lucida Sans"/>
+          <w:lang w:val="en-US"/>
+        </w:rPr>
+      </w:pPr>
+    </w:p>
+    <w:p>
+      <w:pPr>
+        <w:spacing w:after="0"/>
+        <w:rPr>
+          <w:rFonts w:ascii="Lucida Sans" w:hAnsi="Lucida Sans"/>
+          <w:lang w:val="en-US"/>
+        </w:rPr>
+      </w:pPr>
+    </w:p>
+    <w:p>
+      <w:pPr>
+        <w:spacing w:after="0"/>
+        <w:rPr>
+          <w:rFonts w:ascii="Lucida Sans" w:hAnsi="Lucida Sans"/>
+          <w:lang w:val="en-US"/>
+        </w:rPr>
+      </w:pPr>
+    </w:p>
+    <w:p>
+      <w:pPr>
+        <w:spacing w:after="0"/>
+        <w:rPr>
+          <w:rFonts w:ascii="Lucida Sans" w:hAnsi="Lucida Sans"/>
+          <w:lang w:val="en-US"/>
+        </w:rPr>
+      </w:pPr>
+    </w:p>
+    <w:p>
+      <w:pPr>
+        <w:spacing w:after="0"/>
+        <w:rPr>
+          <w:rFonts w:ascii="Lucida Sans" w:hAnsi="Lucida Sans"/>
+          <w:lang w:val="en-US"/>
+        </w:rPr>
+      </w:pPr>
+    </w:p>
+    <w:p>
+      <w:pPr>
+        <w:spacing w:after="0"/>
+        <w:rPr>
+          <w:rFonts w:ascii="Lucida Sans" w:hAnsi="Lucida Sans"/>
+          <w:lang w:val="en-US"/>
+        </w:rPr>
+      </w:pPr>
+    </w:p>
+    <w:p>
+      <w:pPr>
+        <w:spacing w:after="0"/>
+        <w:rPr>
+          <w:rFonts w:ascii="Lucida Sans" w:hAnsi="Lucida Sans"/>
+          <w:lang w:val="en-US"/>
+        </w:rPr>
+      </w:pPr>
+    </w:p>
+    <w:p>
+      <w:pPr>
+        <w:spacing w:after="0"/>
+        <w:rPr>
+          <w:rFonts w:ascii="Lucida Sans" w:hAnsi="Lucida Sans"/>
+          <w:lang w:val="en-US"/>
+        </w:rPr>
+      </w:pPr>
+    </w:p>
+    <w:p>
+      <w:pPr>
+        <w:spacing w:after="0"/>
+        <w:rPr>
+          <w:rFonts w:ascii="Lucida Sans" w:hAnsi="Lucida Sans"/>
+          <w:lang w:val="en-US"/>
+        </w:rPr>
+      </w:pPr>
+      <w:r>
+        <w:rPr>
+          <w:rFonts w:ascii="Lucida Sans" w:hAnsi="Lucida Sans"/>
+          <w:lang w:val="en-US"/>
+        </w:rPr>
+        <w:lastRenderedPageBreak/>
+        <w:t xml:space="preserve">Question 10: </w:t>
       </w:r>
     </w:p>
     <w:p>

</xml_diff>